<commit_message>
docs: add portfolio link to CV
</commit_message>
<xml_diff>
--- a/src/assets/manuel-cuzco-cv.docx
+++ b/src/assets/manuel-cuzco-cv.docx
@@ -62,7 +62,21 @@
           <w:sz w:val="19"/>
         </w:rPr>
         <w:t>linkedin.com/in/manuel-edilberto-cuzco-ramos-805518169</w:t>
+        <w:br/>
       </w:r>
+      <w:hyperlink r:id="rId9">
+        <w:r>
+          <w:rPr>
+            <w:rFonts w:ascii="Arial" w:hAnsi="Arial" w:eastAsia="Arial"/>
+            <w:b w:val="0"/>
+            <w:i w:val="0"/>
+            <w:color w:val="2F5597"/>
+            <w:sz w:val="19"/>
+            <w:u w:val="single"/>
+          </w:rPr>
+          <w:t>Portafolio: 1manuelcuzco.github.io/portafolio</w:t>
+        </w:r>
+      </w:hyperlink>
     </w:p>
     <w:p>
       <w:pPr>

</xml_diff>